<commit_message>
Remove technical delivery wording from client documents
The delivery package should read as client-facing acceptance material, not developer evidence. This removes the repeated functional-scope subtitle and replaces cloud/API infrastructure wording with screen-oriented operational language.

Constraint: Nontechnical reviewers should not see GCloud, Cloud Run, Cloud Scheduler, API, UUIDs, image filenames, or local paths in the DOCX body.

Rejected: Keep infrastructure product names for precision | they make the document look like an engineering handoff instead of acceptance material.

Confidence: high

Scope-risk: narrow

Reversibility: clean

Directive: Keep docs/delivery wording focused on app/admin screens and reviewer actions.

Tested: Extracted DOCX text and checked requested/infra technical terms are absent

Tested: Rendered all DOCX files to PDF and reviewed contact sheet

Not-tested: Manual client review in Microsoft Word
</commit_message>
<xml_diff>
--- a/docs/delivery/00_아가야_개발완료보고서.docx
+++ b/docs/delivery/00_아가야_개발완료보고서.docx
@@ -298,13 +298,14 @@
             <w:pPr>
               <w:spacing w:after="0"/>
             </w:pPr>
-            <w:r/>
+            <w:r>
+              <w:t>서비스 상태</w:t>
+            </w:r>
             <w:r>
               <w:rPr>
                 <w:b w:val="0"/>
                 <w:sz w:val="18"/>
               </w:rPr>
-              <w:t>API 상태</w:t>
             </w:r>
           </w:p>
         </w:tc>
@@ -317,13 +318,14 @@
             <w:pPr>
               <w:spacing w:after="0"/>
             </w:pPr>
-            <w:r/>
+            <w:r>
+              <w:t>운영자가 제공한 서비스 상태 확인 화면</w:t>
+            </w:r>
             <w:r>
               <w:rPr>
                 <w:b w:val="0"/>
                 <w:sz w:val="18"/>
               </w:rPr>
-              <w:t>https://agaya-api-yvdnhntt7a-du.a.run.app/_health</w:t>
             </w:r>
           </w:p>
         </w:tc>
@@ -1372,7 +1374,7 @@
         <w:spacing w:after="40"/>
       </w:pPr>
       <w:r>
-        <w:t>비밀번호, API 키, 관리자 계정 정보는 본 문서에 포함하지 않고 별도 보안 채널로 인계합니다.</w:t>
+        <w:t>비밀번호, 서비스 비밀키, 관리자 계정 정보는 본 문서에 포함하지 않고 별도 보안 채널로 인계합니다.</w:t>
       </w:r>
     </w:p>
     <w:p>

</xml_diff>